<commit_message>
Mejora flujogramas: cabeceras de modelos visibles en flujos de cálculo; Ciudad Limpia integración=DataSphere; Transprensa sin SIESA en fuentes
https://claude.ai/code/session_0136eHscKSBqPfpX133QXv8e
</commit_message>
<xml_diff>
--- a/Documento_Diseno_SAC_Unificado.docx
+++ b/Documento_Diseno_SAC_Unificado.docx
@@ -12538,7 +12538,7 @@
       <w:r>
         <w:drawing>
           <wp:inline>
-            <wp:extent cx="6035040" cy="3100153"/>
+            <wp:extent cx="6035040" cy="3450630"/>
             <wp:docPr id="5" name="Picture 5"/>
             <wp:cNvGraphicFramePr>
               <a:graphicFrameLocks noChangeAspect="1"/>
@@ -12559,7 +12559,7 @@
                   <pic:spPr>
                     <a:xfrm>
                       <a:off x="0" y="0"/>
-                      <a:ext cx="6035040" cy="3100153"/>
+                      <a:ext cx="6035040" cy="3450630"/>
                     </a:xfrm>
                     <a:prstGeom prst="rect"/>
                   </pic:spPr>
@@ -23093,7 +23093,7 @@
           <w:i w:val="0"/>
           <w:sz w:val="20"/>
         </w:rPr>
-        <w:t>La arquitectura integra las fuentes de datos, una capa de dimensiones compartidas, los tres modelos SAC y las salidas de consumo. Los datos reales provienen de SAP S/4HANA mediante conexión nativa (CDS Views); el presupuesto se carga por plantillas Excel y los ajustes se ingresan directamente en SAC.</w:t>
+        <w:t>La arquitectura integra las fuentes de datos, una capa de dimensiones compartidas, los tres modelos SAC y las salidas de consumo. Los datos reales provienen de SAP S/4HANA a través de SAP DataSphere (CDS Views); el presupuesto se carga por plantillas Excel y los ajustes se ingresan directamente en SAC.</w:t>
       </w:r>
     </w:p>
     <w:p>
@@ -28868,7 +28868,7 @@
       <w:r>
         <w:drawing>
           <wp:inline>
-            <wp:extent cx="6035040" cy="3100153"/>
+            <wp:extent cx="6035040" cy="3450630"/>
             <wp:docPr id="8" name="Picture 8"/>
             <wp:cNvGraphicFramePr>
               <a:graphicFrameLocks noChangeAspect="1"/>
@@ -28889,7 +28889,7 @@
                   <pic:spPr>
                     <a:xfrm>
                       <a:off x="0" y="0"/>
-                      <a:ext cx="6035040" cy="3100153"/>
+                      <a:ext cx="6035040" cy="3450630"/>
                     </a:xfrm>
                     <a:prstGeom prst="rect"/>
                   </pic:spPr>
@@ -29276,7 +29276,7 @@
                 <w:i w:val="0"/>
                 <w:sz w:val="16"/>
               </w:rPr>
-              <w:t>CDS Views / conexión nativa SAC–S4</w:t>
+              <w:t>SAP DataSphere (CDS Views)</w:t>
             </w:r>
           </w:p>
         </w:tc>
@@ -37236,7 +37236,7 @@
       <w:r>
         <w:drawing>
           <wp:inline>
-            <wp:extent cx="6035040" cy="3100153"/>
+            <wp:extent cx="6035040" cy="3450630"/>
             <wp:docPr id="11" name="Picture 11"/>
             <wp:cNvGraphicFramePr>
               <a:graphicFrameLocks noChangeAspect="1"/>
@@ -37257,7 +37257,7 @@
                   <pic:spPr>
                     <a:xfrm>
                       <a:off x="0" y="0"/>
-                      <a:ext cx="6035040" cy="3100153"/>
+                      <a:ext cx="6035040" cy="3450630"/>
                     </a:xfrm>
                     <a:prstGeom prst="rect"/>
                   </pic:spPr>

</xml_diff>